<commit_message>
docs(engine): record pull request #62 in the evidence index
</commit_message>
<xml_diff>
--- a/ClaimTrace-Design-Thinking-Searching-and-Verify.docx
+++ b/ClaimTrace-Design-Thinking-Searching-and-Verify.docx
@@ -4838,7 +4838,31 @@
     </w:p>
     <w:p>
       <w:r>
-        <w:t>introduced or established the evidence, not merely the last one to touch the file.</w:t>
+        <w:t>introduced or established the evidence, not merely the last one to touch the file. The document</w:t>
+      </w:r>
+    </w:p>
+    <w:p>
+      <w:r>
+        <w:t xml:space="preserve">itself was delivered as </w:t>
+      </w:r>
+      <w:r>
+        <w:rPr>
+          <w:b/>
+        </w:rPr>
+        <w:t>pull request #62</w:t>
+      </w:r>
+      <w:r>
+        <w:t xml:space="preserve"> (</w:t>
+      </w:r>
+      <w:r>
+        <w:rPr>
+          <w:rFonts w:ascii="Consolas" w:hAnsi="Consolas"/>
+          <w:sz w:val="19"/>
+        </w:rPr>
+        <w:t>engine/design-thinking-searching-and-verify</w:t>
+      </w:r>
+      <w:r>
+        <w:t>).</w:t>
       </w:r>
     </w:p>
     <w:tbl>

</xml_diff>

<commit_message>
docs(engine): correct the extension's scope in the design thinking
The consumer table described the extension as rendering the hover card
from the Verify payload. The extension has been Audit-only since the
audit-only switch, and does not call /api/verify: the hover card is built
from the bibliography entry it matched and shows the claim as not checked.
The row now states the current scope and keeps the constraint that made it
worth listing -- if Verify is wired back into the card, the evidence has
to already be in the payload.
</commit_message>
<xml_diff>
--- a/ClaimTrace-Design-Thinking-Searching-and-Verify.docx
+++ b/ClaimTrace-Design-Thinking-Searching-and-Verify.docx
@@ -859,7 +859,7 @@
               <w:rPr>
                 <w:sz w:val="20"/>
               </w:rPr>
-              <w:t>Extension</w:t>
+              <w:t>Extension (Overleaf hover)</w:t>
             </w:r>
           </w:p>
         </w:tc>
@@ -875,7 +875,40 @@
               <w:rPr>
                 <w:sz w:val="20"/>
               </w:rPr>
-              <w:t>Renders the hover card from the same payload</w:t>
+              <w:t xml:space="preserve">Renders the hover card and the audit panel from </w:t>
+            </w:r>
+            <w:r>
+              <w:rPr>
+                <w:rFonts w:ascii="Consolas" w:hAnsi="Consolas"/>
+                <w:sz w:val="19"/>
+              </w:rPr>
+              <w:t>/api/parse</w:t>
+            </w:r>
+            <w:r>
+              <w:rPr>
+                <w:sz w:val="20"/>
+              </w:rPr>
+              <w:t xml:space="preserve"> and </w:t>
+            </w:r>
+            <w:r>
+              <w:rPr>
+                <w:rFonts w:ascii="Consolas" w:hAnsi="Consolas"/>
+                <w:sz w:val="19"/>
+              </w:rPr>
+              <w:t>/api/audit</w:t>
+            </w:r>
+            <w:r>
+              <w:rPr>
+                <w:sz w:val="20"/>
+              </w:rPr>
+              <w:t xml:space="preserve">; it does not call </w:t>
+            </w:r>
+            <w:r>
+              <w:rPr>
+                <w:rFonts w:ascii="Consolas" w:hAnsi="Consolas"/>
+                <w:sz w:val="19"/>
+              </w:rPr>
+              <w:t>/api/verify</w:t>
             </w:r>
           </w:p>
         </w:tc>
@@ -891,7 +924,7 @@
               <w:rPr>
                 <w:sz w:val="20"/>
               </w:rPr>
-              <w:t>Evidence has to be in the payload, not fetched later</w:t>
+              <w:t>The card is built from local data with no request on hover — so if Verify is wired back into it, the evidence must already be in the payload</w:t>
             </w:r>
           </w:p>
         </w:tc>

</xml_diff>